<commit_message>
docs: upgrade CodeForge Word document with cover, stats grid, stack diagram
- Full-width colored cover banner (title, tagline, framing quote, badge)
- 3-column stats grid (17 capabilities / 10+ MCP / 60-80% savings)
- 5-layer colored architecture stack diagram replacing flat list

Matches the visual design of the PDF version.

https://claude.ai/code/session_01DjWq8NjtgXZAxiTtm9RoLt
</commit_message>
<xml_diff>
--- a/CodeForge-Overview.docx
+++ b/CodeForge-Overview.docx
@@ -2,60 +2,91 @@
 <file path=word/document.xml><?xml version="1.0" encoding="utf-8"?>
 <w:document xmlns:wpc="http://schemas.microsoft.com/office/word/2010/wordprocessingCanvas" xmlns:mo="http://schemas.microsoft.com/office/mac/office/2008/main" xmlns:mc="http://schemas.openxmlformats.org/markup-compatibility/2006" xmlns:mv="urn:schemas-microsoft-com:mac:vml" xmlns:o="urn:schemas-microsoft-com:office:office" xmlns:r="http://schemas.openxmlformats.org/officeDocument/2006/relationships" xmlns:m="http://schemas.openxmlformats.org/officeDocument/2006/math" xmlns:v="urn:schemas-microsoft-com:vml" xmlns:wp14="http://schemas.microsoft.com/office/word/2010/wordprocessingDrawing" xmlns:wp="http://schemas.openxmlformats.org/drawingml/2006/wordprocessingDrawing" xmlns:w10="urn:schemas-microsoft-com:office:word" xmlns:w="http://schemas.openxmlformats.org/wordprocessingml/2006/main" xmlns:w14="http://schemas.microsoft.com/office/word/2010/wordml" xmlns:wpg="http://schemas.microsoft.com/office/word/2010/wordprocessingGroup" xmlns:wpi="http://schemas.microsoft.com/office/word/2010/wordprocessingInk" xmlns:wne="http://schemas.microsoft.com/office/word/2006/wordml" xmlns:wps="http://schemas.microsoft.com/office/word/2010/wordprocessingShape" mc:Ignorable="w14 wp14">
   <w:body>
+    <w:tbl>
+      <w:tblPr>
+        <w:tblW w:type="auto" w:w="0"/>
+        <w:tblLook w:firstColumn="1" w:firstRow="1" w:lastColumn="0" w:lastRow="0" w:noHBand="0" w:noVBand="1" w:val="04A0"/>
+      </w:tblPr>
+      <w:tblGrid>
+        <w:gridCol w:w="9972"/>
+      </w:tblGrid>
+      <w:tr>
+        <w:tc>
+          <w:tcPr>
+            <w:tcW w:type="dxa" w:w="9972"/>
+            <w:shd w:val="clear" w:color="auto" w:fill="0B5ED7"/>
+          </w:tcPr>
+          <w:p>
+            <w:pPr>
+              <w:spacing w:before="1200"/>
+              <w:jc w:val="center"/>
+            </w:pPr>
+            <w:r>
+              <w:rPr>
+                <w:rFonts w:ascii="Calibri" w:hAnsi="Calibri"/>
+                <w:b/>
+                <w:color w:val="FFFFFF"/>
+                <w:sz w:val="144"/>
+              </w:rPr>
+              <w:t>CodeForge</w:t>
+            </w:r>
+          </w:p>
+          <w:p>
+            <w:pPr>
+              <w:jc w:val="center"/>
+              <w:bidi/>
+            </w:pPr>
+            <w:r>
+              <w:rPr>
+                <w:rFonts w:ascii="Calibri" w:hAnsi="Calibri"/>
+                <w:b/>
+                <w:color w:val="FFFFFF"/>
+                <w:sz w:val="40"/>
+              </w:rPr>
+              <w:t>מנוע ה-AI האוניברסלי לבניית כל דבר</w:t>
+            </w:r>
+          </w:p>
+          <w:p>
+            <w:pPr>
+              <w:spacing w:before="400"/>
+              <w:jc w:val="center"/>
+              <w:bidi/>
+            </w:pPr>
+            <w:r>
+              <w:rPr>
+                <w:rFonts w:ascii="Calibri" w:hAnsi="Calibri"/>
+                <w:i/>
+                <w:color w:val="E7F1FE"/>
+                <w:sz w:val="26"/>
+              </w:rPr>
+              <w:t>מערכת אחת. כל מסגרת פיתוח. כל פלטפורמה. כל פרויקט.</w:t>
+              <w:br/>
+              <w:t>מ-prompt בעברית לאפליקציה חיה בייצור — תוך דקות.</w:t>
+            </w:r>
+          </w:p>
+          <w:p>
+            <w:pPr>
+              <w:spacing w:before="600" w:after="1200"/>
+              <w:jc w:val="center"/>
+              <w:bidi/>
+            </w:pPr>
+            <w:r>
+              <w:rPr>
+                <w:rFonts w:ascii="Calibri" w:hAnsi="Calibri"/>
+                <w:color w:val="E7F1FE"/>
+                <w:sz w:val="22"/>
+              </w:rPr>
+              <w:t>מסמך תקציר · מבוסס על 15 מחקרים עצמאיים מעמיקים</w:t>
+            </w:r>
+          </w:p>
+        </w:tc>
+      </w:tr>
+    </w:tbl>
     <w:p>
-      <w:pPr>
-        <w:jc w:val="center"/>
-      </w:pPr>
       <w:r>
-        <w:rPr>
-          <w:rFonts w:ascii="Calibri" w:hAnsi="Calibri"/>
-          <w:b/>
-          <w:color w:val="0B5ED7"/>
-          <w:sz w:val="112"/>
-        </w:rPr>
-        <w:t>CodeForge</w:t>
+        <w:br w:type="page"/>
       </w:r>
     </w:p>
-    <w:p>
-      <w:pPr>
-        <w:jc w:val="center"/>
-        <w:bidi/>
-      </w:pPr>
-      <w:r>
-        <w:rPr>
-          <w:rFonts w:ascii="Calibri" w:hAnsi="Calibri"/>
-          <w:color w:val="1A1A2E"/>
-          <w:sz w:val="40"/>
-        </w:rPr>
-        <w:t>מנוע ה-AI האוניברסלי לבניית כל דבר</w:t>
-      </w:r>
-    </w:p>
-    <w:p>
-      <w:pPr>
-        <w:pBdr>
-          <w:bottom w:val="single" w:sz="8" w:space="1" w:color="0B5ED7"/>
-        </w:pBdr>
-      </w:pPr>
-    </w:p>
-    <w:p>
-      <w:pPr>
-        <w:jc w:val="center"/>
-        <w:bidi/>
-      </w:pPr>
-      <w:r>
-        <w:rPr>
-          <w:rFonts w:ascii="Calibri" w:hAnsi="Calibri"/>
-          <w:i/>
-          <w:color w:val="6B7280"/>
-          <w:sz w:val="26"/>
-        </w:rPr>
-        <w:t>מערכת אחת. כל מסגרת פיתוח. כל פלטפורמה. כל פרויקט.</w:t>
-        <w:br/>
-        <w:t>מ-prompt בעברית לאפליקציה חיה בייצור — תוך דקות.</w:t>
-      </w:r>
-    </w:p>
-    <w:p/>
-    <w:p/>
     <w:p>
       <w:pPr>
         <w:bidi/>
@@ -104,6 +135,149 @@
         <w:t>זו לא רק "עוד צ'אט AI לקוד" — זו תשתית שמשלבת את הטוב מ-Claude Code, v0, Bolt ו-Devin, ושמה את הבעלות, הגמישות והאוטונומיה בידיים שלך.</w:t>
       </w:r>
     </w:p>
+    <w:p/>
+    <w:tbl>
+      <w:tblPr>
+        <w:tblW w:type="auto" w:w="0"/>
+        <w:jc w:val="center"/>
+        <w:tblLook w:firstColumn="1" w:firstRow="1" w:lastColumn="0" w:lastRow="0" w:noHBand="0" w:noVBand="1" w:val="04A0"/>
+        <w:bidiVisual/>
+      </w:tblPr>
+      <w:tblGrid>
+        <w:gridCol w:w="3324"/>
+        <w:gridCol w:w="3324"/>
+        <w:gridCol w:w="3324"/>
+      </w:tblGrid>
+      <w:tr>
+        <w:tc>
+          <w:tcPr>
+            <w:tcW w:type="dxa" w:w="3324"/>
+            <w:shd w:val="clear" w:color="auto" w:fill="F3F6FB"/>
+            <w:tcBorders>
+              <w:top w:val="single" w:sz="6" w:color="0B5ED7"/>
+              <w:left w:val="single" w:sz="6" w:color="0B5ED7"/>
+              <w:bottom w:val="single" w:sz="6" w:color="0B5ED7"/>
+              <w:right w:val="single" w:sz="6" w:color="0B5ED7"/>
+            </w:tcBorders>
+            <w:vAlign w:val="center"/>
+          </w:tcPr>
+          <w:p>
+            <w:pPr>
+              <w:bidi/>
+              <w:jc w:val="center"/>
+            </w:pPr>
+            <w:r>
+              <w:rPr>
+                <w:rFonts w:ascii="Calibri" w:hAnsi="Calibri"/>
+                <w:b/>
+                <w:color w:val="0B5ED7"/>
+                <w:sz w:val="48"/>
+              </w:rPr>
+              <w:t>17</w:t>
+            </w:r>
+          </w:p>
+          <w:p>
+            <w:pPr>
+              <w:bidi/>
+              <w:jc w:val="center"/>
+            </w:pPr>
+            <w:r>
+              <w:rPr>
+                <w:rFonts w:ascii="Calibri" w:hAnsi="Calibri"/>
+                <w:color w:val="6B7280"/>
+                <w:sz w:val="18"/>
+              </w:rPr>
+              <w:t>יכולות זהות ל-Claude Code</w:t>
+            </w:r>
+          </w:p>
+        </w:tc>
+        <w:tc>
+          <w:tcPr>
+            <w:tcW w:type="dxa" w:w="3324"/>
+            <w:shd w:val="clear" w:color="auto" w:fill="F3F6FB"/>
+            <w:tcBorders>
+              <w:top w:val="single" w:sz="6" w:color="0B5ED7"/>
+              <w:left w:val="single" w:sz="6" w:color="0B5ED7"/>
+              <w:bottom w:val="single" w:sz="6" w:color="0B5ED7"/>
+              <w:right w:val="single" w:sz="6" w:color="0B5ED7"/>
+            </w:tcBorders>
+            <w:vAlign w:val="center"/>
+          </w:tcPr>
+          <w:p>
+            <w:pPr>
+              <w:bidi/>
+              <w:jc w:val="center"/>
+            </w:pPr>
+            <w:r>
+              <w:rPr>
+                <w:rFonts w:ascii="Calibri" w:hAnsi="Calibri"/>
+                <w:b/>
+                <w:color w:val="0B5ED7"/>
+                <w:sz w:val="48"/>
+              </w:rPr>
+              <w:t>10+</w:t>
+            </w:r>
+          </w:p>
+          <w:p>
+            <w:pPr>
+              <w:bidi/>
+              <w:jc w:val="center"/>
+            </w:pPr>
+            <w:r>
+              <w:rPr>
+                <w:rFonts w:ascii="Calibri" w:hAnsi="Calibri"/>
+                <w:color w:val="6B7280"/>
+                <w:sz w:val="18"/>
+              </w:rPr>
+              <w:t>אינטגרציות MCP מ-day one</w:t>
+            </w:r>
+          </w:p>
+        </w:tc>
+        <w:tc>
+          <w:tcPr>
+            <w:tcW w:type="dxa" w:w="3324"/>
+            <w:shd w:val="clear" w:color="auto" w:fill="F3F6FB"/>
+            <w:tcBorders>
+              <w:top w:val="single" w:sz="6" w:color="0B5ED7"/>
+              <w:left w:val="single" w:sz="6" w:color="0B5ED7"/>
+              <w:bottom w:val="single" w:sz="6" w:color="0B5ED7"/>
+              <w:right w:val="single" w:sz="6" w:color="0B5ED7"/>
+            </w:tcBorders>
+            <w:vAlign w:val="center"/>
+          </w:tcPr>
+          <w:p>
+            <w:pPr>
+              <w:bidi/>
+              <w:jc w:val="center"/>
+            </w:pPr>
+            <w:r>
+              <w:rPr>
+                <w:rFonts w:ascii="Calibri" w:hAnsi="Calibri"/>
+                <w:b/>
+                <w:color w:val="0B5ED7"/>
+                <w:sz w:val="48"/>
+              </w:rPr>
+              <w:t>60-80%</w:t>
+            </w:r>
+          </w:p>
+          <w:p>
+            <w:pPr>
+              <w:bidi/>
+              <w:jc w:val="center"/>
+            </w:pPr>
+            <w:r>
+              <w:rPr>
+                <w:rFonts w:ascii="Calibri" w:hAnsi="Calibri"/>
+                <w:color w:val="6B7280"/>
+                <w:sz w:val="18"/>
+              </w:rPr>
+              <w:t>חיסכון בעלות API</w:t>
+            </w:r>
+          </w:p>
+        </w:tc>
+      </w:tr>
+    </w:tbl>
+    <w:p/>
     <w:p>
       <w:pPr>
         <w:bidi/>
@@ -2996,116 +3170,202 @@
         <w:t>חמש שכבות מובנות, כל אחת ניתנת להחלפה:</w:t>
       </w:r>
     </w:p>
-    <w:p>
-      <w:pPr>
-        <w:bidi/>
-        <w:jc w:val="right"/>
-      </w:pPr>
-      <w:r>
-        <w:rPr>
-          <w:rFonts w:ascii="Calibri" w:hAnsi="Calibri"/>
-          <w:b/>
-          <w:color w:val="0B5ED7"/>
-          <w:sz w:val="24"/>
-        </w:rPr>
-        <w:t xml:space="preserve">1. שכבת ממשק — </w:t>
-      </w:r>
-      <w:r>
-        <w:rPr>
-          <w:rFonts w:ascii="Calibri" w:hAnsi="Calibri"/>
-          <w:sz w:val="22"/>
-        </w:rPr>
-        <w:t>Next.js 15 + AI SDK v5 — Chat, Monaco Editor, Live Preview, File Tree</w:t>
-      </w:r>
-    </w:p>
-    <w:p>
-      <w:pPr>
-        <w:bidi/>
-        <w:jc w:val="right"/>
-      </w:pPr>
-      <w:r>
-        <w:rPr>
-          <w:rFonts w:ascii="Calibri" w:hAnsi="Calibri"/>
-          <w:b/>
-          <w:color w:val="0B5ED7"/>
-          <w:sz w:val="24"/>
-        </w:rPr>
-        <w:t xml:space="preserve">2. שכבת Agent — </w:t>
-      </w:r>
-      <w:r>
-        <w:rPr>
-          <w:rFonts w:ascii="Calibri" w:hAnsi="Calibri"/>
-          <w:sz w:val="22"/>
-        </w:rPr>
-        <w:t>Single-agent harness + sub-agents on demand. כלים: Read/Edit/Write/Bash/Grep/Web/Browser</w:t>
-      </w:r>
-    </w:p>
-    <w:p>
-      <w:pPr>
-        <w:bidi/>
-        <w:jc w:val="right"/>
-      </w:pPr>
-      <w:r>
-        <w:rPr>
-          <w:rFonts w:ascii="Calibri" w:hAnsi="Calibri"/>
-          <w:b/>
-          <w:color w:val="0B5ED7"/>
-          <w:sz w:val="24"/>
-        </w:rPr>
-        <w:t xml:space="preserve">3. שכבת אינטליגנציה — </w:t>
-      </w:r>
-      <w:r>
-        <w:rPr>
-          <w:rFonts w:ascii="Calibri" w:hAnsi="Calibri"/>
-          <w:sz w:val="22"/>
-        </w:rPr>
-        <w:t>Multi-Provider Routing (Claude/GPT/Gemini) + MCP Gateway (10+ שרתים) + Sandbox (Firecracker)</w:t>
-      </w:r>
-    </w:p>
-    <w:p>
-      <w:pPr>
-        <w:bidi/>
-        <w:jc w:val="right"/>
-      </w:pPr>
-      <w:r>
-        <w:rPr>
-          <w:rFonts w:ascii="Calibri" w:hAnsi="Calibri"/>
-          <w:b/>
-          <w:color w:val="0B5ED7"/>
-          <w:sz w:val="24"/>
-        </w:rPr>
-        <w:t xml:space="preserve">4. שכבת Storage — </w:t>
-      </w:r>
-      <w:r>
-        <w:rPr>
-          <w:rFonts w:ascii="Calibri" w:hAnsi="Calibri"/>
-          <w:sz w:val="22"/>
-        </w:rPr>
-        <w:t>Neon Postgres + pgvector | Cloudflare R2 | WorkOS Auth | Stripe Billing | Inngest Jobs</w:t>
-      </w:r>
-    </w:p>
-    <w:p>
-      <w:pPr>
-        <w:bidi/>
-        <w:jc w:val="right"/>
-      </w:pPr>
-      <w:r>
-        <w:rPr>
-          <w:rFonts w:ascii="Calibri" w:hAnsi="Calibri"/>
-          <w:b/>
-          <w:color w:val="0B5ED7"/>
-          <w:sz w:val="24"/>
-        </w:rPr>
-        <w:t xml:space="preserve">5. שכבת Deploy — </w:t>
-      </w:r>
-      <w:r>
-        <w:rPr>
-          <w:rFonts w:ascii="Calibri" w:hAnsi="Calibri"/>
-          <w:sz w:val="22"/>
-        </w:rPr>
-        <w:t>Vercel | Cloudflare Pages | Netlify | Custom infrastructure</w:t>
-      </w:r>
-    </w:p>
+    <w:p/>
+    <w:tbl>
+      <w:tblPr>
+        <w:tblW w:type="auto" w:w="0"/>
+        <w:tblLook w:firstColumn="1" w:firstRow="1" w:lastColumn="0" w:lastRow="0" w:noHBand="0" w:noVBand="1" w:val="04A0"/>
+        <w:bidiVisual/>
+      </w:tblPr>
+      <w:tblGrid>
+        <w:gridCol w:w="9972"/>
+      </w:tblGrid>
+      <w:tr>
+        <w:tc>
+          <w:tcPr>
+            <w:tcW w:type="dxa" w:w="9972"/>
+            <w:shd w:val="clear" w:color="auto" w:fill="0B5ED7"/>
+          </w:tcPr>
+          <w:p>
+            <w:pPr>
+              <w:bidi/>
+              <w:jc w:val="right"/>
+            </w:pPr>
+            <w:r>
+              <w:rPr>
+                <w:rFonts w:ascii="Calibri" w:hAnsi="Calibri"/>
+                <w:b/>
+                <w:color w:val="FFFFFF"/>
+                <w:sz w:val="26"/>
+              </w:rPr>
+              <w:t>1. שכבת ממשק (Frontend)</w:t>
+            </w:r>
+          </w:p>
+          <w:p>
+            <w:pPr>
+              <w:bidi/>
+              <w:jc w:val="right"/>
+            </w:pPr>
+            <w:r>
+              <w:rPr>
+                <w:rFonts w:ascii="Calibri" w:hAnsi="Calibri"/>
+                <w:color w:val="FFFFFF"/>
+                <w:sz w:val="20"/>
+              </w:rPr>
+              <w:t>Next.js 15 + AI SDK v5 · Chat · Monaco Editor · Live Preview · File Tree</w:t>
+            </w:r>
+          </w:p>
+        </w:tc>
+      </w:tr>
+      <w:tr>
+        <w:tc>
+          <w:tcPr>
+            <w:tcW w:type="dxa" w:w="9972"/>
+            <w:shd w:val="clear" w:color="auto" w:fill="1E40AF"/>
+          </w:tcPr>
+          <w:p>
+            <w:pPr>
+              <w:bidi/>
+              <w:jc w:val="right"/>
+            </w:pPr>
+            <w:r>
+              <w:rPr>
+                <w:rFonts w:ascii="Calibri" w:hAnsi="Calibri"/>
+                <w:b/>
+                <w:color w:val="FFFFFF"/>
+                <w:sz w:val="26"/>
+              </w:rPr>
+              <w:t>2. שכבת Agent</w:t>
+            </w:r>
+          </w:p>
+          <w:p>
+            <w:pPr>
+              <w:bidi/>
+              <w:jc w:val="right"/>
+            </w:pPr>
+            <w:r>
+              <w:rPr>
+                <w:rFonts w:ascii="Calibri" w:hAnsi="Calibri"/>
+                <w:color w:val="FFFFFF"/>
+                <w:sz w:val="20"/>
+              </w:rPr>
+              <w:t>Single-agent harness + sub-agents · כלים: Read · Edit · Write · Bash · Grep · Web · Browser</w:t>
+            </w:r>
+          </w:p>
+        </w:tc>
+      </w:tr>
+      <w:tr>
+        <w:tc>
+          <w:tcPr>
+            <w:tcW w:type="dxa" w:w="9972"/>
+            <w:shd w:val="clear" w:color="auto" w:fill="5B21B6"/>
+          </w:tcPr>
+          <w:p>
+            <w:pPr>
+              <w:bidi/>
+              <w:jc w:val="right"/>
+            </w:pPr>
+            <w:r>
+              <w:rPr>
+                <w:rFonts w:ascii="Calibri" w:hAnsi="Calibri"/>
+                <w:b/>
+                <w:color w:val="FFFFFF"/>
+                <w:sz w:val="26"/>
+              </w:rPr>
+              <w:t>3. שכבת אינטליגנציה</w:t>
+            </w:r>
+          </w:p>
+          <w:p>
+            <w:pPr>
+              <w:bidi/>
+              <w:jc w:val="right"/>
+            </w:pPr>
+            <w:r>
+              <w:rPr>
+                <w:rFonts w:ascii="Calibri" w:hAnsi="Calibri"/>
+                <w:color w:val="FFFFFF"/>
+                <w:sz w:val="20"/>
+              </w:rPr>
+              <w:t>Multi-Provider Routing · MCP Gateway (10+ servers) · Sandbox (Firecracker microVMs)</w:t>
+            </w:r>
+          </w:p>
+        </w:tc>
+      </w:tr>
+      <w:tr>
+        <w:tc>
+          <w:tcPr>
+            <w:tcW w:type="dxa" w:w="9972"/>
+            <w:shd w:val="clear" w:color="auto" w:fill="7C2D12"/>
+          </w:tcPr>
+          <w:p>
+            <w:pPr>
+              <w:bidi/>
+              <w:jc w:val="right"/>
+            </w:pPr>
+            <w:r>
+              <w:rPr>
+                <w:rFonts w:ascii="Calibri" w:hAnsi="Calibri"/>
+                <w:b/>
+                <w:color w:val="FFFFFF"/>
+                <w:sz w:val="26"/>
+              </w:rPr>
+              <w:t>4. שכבת Storage &amp; Services</w:t>
+            </w:r>
+          </w:p>
+          <w:p>
+            <w:pPr>
+              <w:bidi/>
+              <w:jc w:val="right"/>
+            </w:pPr>
+            <w:r>
+              <w:rPr>
+                <w:rFonts w:ascii="Calibri" w:hAnsi="Calibri"/>
+                <w:color w:val="FFFFFF"/>
+                <w:sz w:val="20"/>
+              </w:rPr>
+              <w:t>Neon Postgres + pgvector · Cloudflare R2 · WorkOS Auth · Stripe · Inngest</w:t>
+            </w:r>
+          </w:p>
+        </w:tc>
+      </w:tr>
+      <w:tr>
+        <w:tc>
+          <w:tcPr>
+            <w:tcW w:type="dxa" w:w="9972"/>
+            <w:shd w:val="clear" w:color="auto" w:fill="1A1A2E"/>
+          </w:tcPr>
+          <w:p>
+            <w:pPr>
+              <w:bidi/>
+              <w:jc w:val="right"/>
+            </w:pPr>
+            <w:r>
+              <w:rPr>
+                <w:rFonts w:ascii="Calibri" w:hAnsi="Calibri"/>
+                <w:b/>
+                <w:color w:val="FFFFFF"/>
+                <w:sz w:val="26"/>
+              </w:rPr>
+              <w:t>5. שכבת Deploy</w:t>
+            </w:r>
+          </w:p>
+          <w:p>
+            <w:pPr>
+              <w:bidi/>
+              <w:jc w:val="right"/>
+            </w:pPr>
+            <w:r>
+              <w:rPr>
+                <w:rFonts w:ascii="Calibri" w:hAnsi="Calibri"/>
+                <w:color w:val="FFFFFF"/>
+                <w:sz w:val="20"/>
+              </w:rPr>
+              <w:t>Vercel · Cloudflare Pages · Netlify · Custom infrastructure</w:t>
+            </w:r>
+          </w:p>
+        </w:tc>
+      </w:tr>
+    </w:tbl>
     <w:p/>
     <w:p>
       <w:pPr>

</xml_diff>